<commit_message>
Update Lab5 materials: ML build guide, MV CNN notebook and demo guide
</commit_message>
<xml_diff>
--- a/courses/ml/labs/Lab5AnswerTemplate.docx
+++ b/courses/ml/labs/Lab5AnswerTemplate.docx
@@ -115,6 +115,26 @@
       <w:pPr>
         <w:spacing w:after="0"/>
         <w:rPr>
+          <w:b/>
+          <w:bCs/>
+          <w:color w:val="FF0000"/>
+          <w:sz w:val="24"/>
+          <w:szCs w:val="24"/>
+          <w:lang w:eastAsia="zh-CN"/>
+        </w:rPr>
+      </w:pPr>
+      <w:r>
+        <w:rPr>
+          <w:b/>
+          <w:bCs/>
+          <w:color w:val="FF0000"/>
+          <w:sz w:val="24"/>
+          <w:szCs w:val="24"/>
+        </w:rPr>
+        <w:t>Student Name:</w:t>
+      </w:r>
+      <w:r>
+        <w:rPr>
           <w:rFonts w:hint="eastAsia"/>
           <w:b/>
           <w:bCs/>
@@ -123,8 +143,12 @@
           <w:szCs w:val="24"/>
           <w:lang w:eastAsia="zh-CN"/>
         </w:rPr>
-      </w:pPr>
-      <w:r>
+        <w:t xml:space="preserve"> Wang Peng</w:t>
+      </w:r>
+    </w:p>
+    <w:p>
+      <w:pPr>
+        <w:spacing w:after="0"/>
         <w:rPr>
           <w:b/>
           <w:bCs/>
@@ -132,7 +156,29 @@
           <w:sz w:val="24"/>
           <w:szCs w:val="24"/>
         </w:rPr>
-        <w:t>Student Name:</w:t>
+      </w:pPr>
+    </w:p>
+    <w:p>
+      <w:pPr>
+        <w:spacing w:after="0"/>
+        <w:rPr>
+          <w:b/>
+          <w:bCs/>
+          <w:color w:val="FF0000"/>
+          <w:sz w:val="24"/>
+          <w:szCs w:val="24"/>
+          <w:lang w:eastAsia="zh-CN"/>
+        </w:rPr>
+      </w:pPr>
+      <w:r>
+        <w:rPr>
+          <w:b/>
+          <w:bCs/>
+          <w:color w:val="FF0000"/>
+          <w:sz w:val="24"/>
+          <w:szCs w:val="24"/>
+        </w:rPr>
+        <w:t>Student Number:</w:t>
       </w:r>
       <w:r>
         <w:rPr>
@@ -144,7 +190,7 @@
           <w:szCs w:val="24"/>
           <w:lang w:eastAsia="zh-CN"/>
         </w:rPr>
-        <w:t xml:space="preserve"> Wang Peng</w:t>
+        <w:t xml:space="preserve"> 041107730</w:t>
       </w:r>
     </w:p>
     <w:p>
@@ -163,112 +209,64 @@
       <w:pPr>
         <w:spacing w:after="0"/>
         <w:rPr>
-          <w:rFonts w:hint="eastAsia"/>
+          <w:b/>
+          <w:bCs/>
+          <w:sz w:val="24"/>
+          <w:szCs w:val="24"/>
+        </w:rPr>
+      </w:pPr>
+      <w:r>
+        <w:rPr>
+          <w:sz w:val="24"/>
+          <w:szCs w:val="24"/>
+        </w:rPr>
+        <w:t xml:space="preserve">When you </w:t>
+      </w:r>
+      <w:r>
+        <w:rPr>
+          <w:sz w:val="24"/>
+          <w:szCs w:val="24"/>
+        </w:rPr>
+        <w:t xml:space="preserve">take screenshots of subprocesses, </w:t>
+      </w:r>
+      <w:r>
+        <w:rPr>
+          <w:sz w:val="24"/>
+          <w:szCs w:val="24"/>
+        </w:rPr>
+        <w:t xml:space="preserve">all operators </w:t>
+      </w:r>
+      <w:r>
+        <w:rPr>
+          <w:sz w:val="24"/>
+          <w:szCs w:val="24"/>
+        </w:rPr>
+        <w:t>must</w:t>
+      </w:r>
+      <w:r>
+        <w:rPr>
+          <w:sz w:val="24"/>
+          <w:szCs w:val="24"/>
+        </w:rPr>
+        <w:t xml:space="preserve"> be visible</w:t>
+      </w:r>
+      <w:r>
+        <w:rPr>
+          <w:sz w:val="24"/>
+          <w:szCs w:val="24"/>
+        </w:rPr>
+        <w:t>.</w:t>
+      </w:r>
+    </w:p>
+    <w:p>
+      <w:pPr>
+        <w:spacing w:after="0"/>
+        <w:rPr>
           <w:b/>
           <w:bCs/>
           <w:color w:val="FF0000"/>
           <w:sz w:val="24"/>
           <w:szCs w:val="24"/>
-          <w:lang w:eastAsia="zh-CN"/>
-        </w:rPr>
-      </w:pPr>
-      <w:r>
-        <w:rPr>
-          <w:b/>
-          <w:bCs/>
-          <w:color w:val="FF0000"/>
-          <w:sz w:val="24"/>
-          <w:szCs w:val="24"/>
-        </w:rPr>
-        <w:t>Student Number:</w:t>
-      </w:r>
-      <w:r>
-        <w:rPr>
-          <w:rFonts w:hint="eastAsia"/>
-          <w:b/>
-          <w:bCs/>
-          <w:color w:val="FF0000"/>
-          <w:sz w:val="24"/>
-          <w:szCs w:val="24"/>
-          <w:lang w:eastAsia="zh-CN"/>
-        </w:rPr>
-        <w:t xml:space="preserve"> 041107730</w:t>
-      </w:r>
-    </w:p>
-    <w:p>
-      <w:pPr>
-        <w:spacing w:after="0"/>
-        <w:rPr>
-          <w:b/>
-          <w:bCs/>
-          <w:color w:val="FF0000"/>
-          <w:sz w:val="24"/>
-          <w:szCs w:val="24"/>
-        </w:rPr>
-      </w:pPr>
-    </w:p>
-    <w:p>
-      <w:pPr>
-        <w:spacing w:after="0"/>
-        <w:rPr>
-          <w:b/>
-          <w:bCs/>
-          <w:sz w:val="24"/>
-          <w:szCs w:val="24"/>
-        </w:rPr>
-      </w:pPr>
-      <w:r>
-        <w:rPr>
-          <w:sz w:val="24"/>
-          <w:szCs w:val="24"/>
-        </w:rPr>
-        <w:t xml:space="preserve">When you </w:t>
-      </w:r>
-      <w:r>
-        <w:rPr>
-          <w:sz w:val="24"/>
-          <w:szCs w:val="24"/>
-        </w:rPr>
-        <w:t xml:space="preserve">take screenshots of subprocesses, </w:t>
-      </w:r>
-      <w:r>
-        <w:rPr>
-          <w:sz w:val="24"/>
-          <w:szCs w:val="24"/>
-        </w:rPr>
-        <w:t xml:space="preserve">all operators </w:t>
-      </w:r>
-      <w:r>
-        <w:rPr>
-          <w:sz w:val="24"/>
-          <w:szCs w:val="24"/>
-        </w:rPr>
-        <w:t>must</w:t>
-      </w:r>
-      <w:r>
-        <w:rPr>
-          <w:sz w:val="24"/>
-          <w:szCs w:val="24"/>
-        </w:rPr>
-        <w:t xml:space="preserve"> be visible</w:t>
-      </w:r>
-      <w:r>
-        <w:rPr>
-          <w:sz w:val="24"/>
-          <w:szCs w:val="24"/>
-        </w:rPr>
-        <w:t>.</w:t>
-      </w:r>
-    </w:p>
-    <w:p>
-      <w:pPr>
-        <w:spacing w:after="0"/>
-        <w:rPr>
-          <w:b/>
-          <w:bCs/>
-          <w:color w:val="FF0000"/>
-          <w:sz w:val="24"/>
-          <w:szCs w:val="24"/>
         </w:rPr>
       </w:pPr>
     </w:p>
@@ -298,7 +296,7 @@
     </w:p>
     <w:p>
       <w:pPr>
-        <w:pStyle w:val="ListParagraph"/>
+        <w:pStyle w:val="a4"/>
         <w:numPr>
           <w:ilvl w:val="0"/>
           <w:numId w:val="5"/>
@@ -314,28 +312,12 @@
           <w:sz w:val="24"/>
           <w:szCs w:val="24"/>
         </w:rPr>
-        <w:t xml:space="preserve">Screenshot of </w:t>
-      </w:r>
-      <w:proofErr w:type="spellStart"/>
-      <w:r>
-        <w:rPr>
-          <w:sz w:val="24"/>
-          <w:szCs w:val="24"/>
-        </w:rPr>
-        <w:t>DataPrep</w:t>
-      </w:r>
-      <w:proofErr w:type="spellEnd"/>
-      <w:r>
-        <w:rPr>
-          <w:sz w:val="24"/>
-          <w:szCs w:val="24"/>
-        </w:rPr>
-        <w:t xml:space="preserve"> subprocess. </w:t>
-      </w:r>
-    </w:p>
-    <w:p>
-      <w:pPr>
-        <w:pStyle w:val="ListParagraph"/>
+        <w:t xml:space="preserve">Screenshot of DataPrep subprocess. </w:t>
+      </w:r>
+    </w:p>
+    <w:p>
+      <w:pPr>
+        <w:pStyle w:val="a4"/>
         <w:rPr>
           <w:sz w:val="24"/>
           <w:szCs w:val="24"/>
@@ -384,7 +366,7 @@
     </w:p>
     <w:p>
       <w:pPr>
-        <w:pStyle w:val="ListParagraph"/>
+        <w:pStyle w:val="a4"/>
         <w:spacing w:after="0"/>
         <w:rPr>
           <w:sz w:val="24"/>
@@ -394,7 +376,7 @@
     </w:p>
     <w:p>
       <w:pPr>
-        <w:pStyle w:val="ListParagraph"/>
+        <w:pStyle w:val="a4"/>
         <w:numPr>
           <w:ilvl w:val="0"/>
           <w:numId w:val="5"/>
@@ -429,7 +411,7 @@
     </w:p>
     <w:p>
       <w:pPr>
-        <w:pStyle w:val="ListParagraph"/>
+        <w:pStyle w:val="a4"/>
         <w:rPr>
           <w:sz w:val="24"/>
           <w:szCs w:val="24"/>
@@ -478,16 +460,16 @@
     </w:p>
     <w:p>
       <w:pPr>
-        <w:pStyle w:val="ListParagraph"/>
-        <w:rPr>
-          <w:sz w:val="24"/>
-          <w:szCs w:val="24"/>
-        </w:rPr>
-      </w:pPr>
-    </w:p>
-    <w:p>
-      <w:pPr>
-        <w:pStyle w:val="ListParagraph"/>
+        <w:pStyle w:val="a4"/>
+        <w:rPr>
+          <w:sz w:val="24"/>
+          <w:szCs w:val="24"/>
+        </w:rPr>
+      </w:pPr>
+    </w:p>
+    <w:p>
+      <w:pPr>
+        <w:pStyle w:val="a4"/>
         <w:numPr>
           <w:ilvl w:val="0"/>
           <w:numId w:val="5"/>
@@ -509,7 +491,7 @@
     </w:p>
     <w:p>
       <w:pPr>
-        <w:pStyle w:val="ListParagraph"/>
+        <w:pStyle w:val="a4"/>
         <w:rPr>
           <w:sz w:val="24"/>
           <w:szCs w:val="24"/>
@@ -520,7 +502,7 @@
           <w:noProof/>
         </w:rPr>
         <w:drawing>
-          <wp:inline distT="0" distB="0" distL="0" distR="0" wp14:anchorId="68266DBB" wp14:editId="12B44375">
+          <wp:inline distT="0" distB="0" distL="0" distR="0" wp14:anchorId="68266DBB" wp14:editId="6EF71E72">
             <wp:extent cx="5943600" cy="1547495"/>
             <wp:effectExtent l="0" t="0" r="0" b="0"/>
             <wp:docPr id="1772795944" name="Picture 2"/>
@@ -571,7 +553,7 @@
     </w:p>
     <w:p>
       <w:pPr>
-        <w:pStyle w:val="ListParagraph"/>
+        <w:pStyle w:val="a4"/>
         <w:spacing w:after="0"/>
         <w:rPr>
           <w:sz w:val="24"/>
@@ -581,7 +563,7 @@
     </w:p>
     <w:p>
       <w:pPr>
-        <w:pStyle w:val="ListParagraph"/>
+        <w:pStyle w:val="a4"/>
         <w:numPr>
           <w:ilvl w:val="0"/>
           <w:numId w:val="5"/>
@@ -665,16 +647,16 @@
     </w:p>
     <w:p>
       <w:pPr>
-        <w:pStyle w:val="ListParagraph"/>
-        <w:rPr>
-          <w:sz w:val="24"/>
-          <w:szCs w:val="24"/>
-        </w:rPr>
-      </w:pPr>
-    </w:p>
-    <w:p>
-      <w:pPr>
-        <w:pStyle w:val="ListParagraph"/>
+        <w:pStyle w:val="a4"/>
+        <w:rPr>
+          <w:sz w:val="24"/>
+          <w:szCs w:val="24"/>
+        </w:rPr>
+      </w:pPr>
+    </w:p>
+    <w:p>
+      <w:pPr>
+        <w:pStyle w:val="a4"/>
         <w:numPr>
           <w:ilvl w:val="0"/>
           <w:numId w:val="5"/>
@@ -713,7 +695,7 @@
           <w:noProof/>
         </w:rPr>
         <w:drawing>
-          <wp:inline distT="0" distB="0" distL="0" distR="0" wp14:anchorId="1F86C6EA" wp14:editId="7065F6A6">
+          <wp:inline distT="0" distB="0" distL="0" distR="0" wp14:anchorId="1F86C6EA" wp14:editId="6D5B9F31">
             <wp:extent cx="5943600" cy="3076575"/>
             <wp:effectExtent l="0" t="0" r="0" b="9525"/>
             <wp:docPr id="507663567" name="Picture 3"/>
@@ -773,7 +755,7 @@
     </w:p>
     <w:p>
       <w:pPr>
-        <w:pStyle w:val="ListParagraph"/>
+        <w:pStyle w:val="a4"/>
         <w:numPr>
           <w:ilvl w:val="0"/>
           <w:numId w:val="5"/>
@@ -805,7 +787,7 @@
           <w:noProof/>
         </w:rPr>
         <w:drawing>
-          <wp:inline distT="0" distB="0" distL="0" distR="0" wp14:anchorId="42B4A574" wp14:editId="68A3D66D">
+          <wp:inline distT="0" distB="0" distL="0" distR="0" wp14:anchorId="42B4A574" wp14:editId="06224FCA">
             <wp:extent cx="5943600" cy="908685"/>
             <wp:effectExtent l="0" t="0" r="0" b="5715"/>
             <wp:docPr id="403611189" name="Picture 1"/>
@@ -879,7 +861,7 @@
     </w:p>
     <w:p>
       <w:pPr>
-        <w:pStyle w:val="ListParagraph"/>
+        <w:pStyle w:val="a4"/>
         <w:numPr>
           <w:ilvl w:val="0"/>
           <w:numId w:val="8"/>
@@ -895,28 +877,12 @@
           <w:sz w:val="24"/>
           <w:szCs w:val="24"/>
         </w:rPr>
-        <w:t xml:space="preserve">Screenshot of </w:t>
-      </w:r>
-      <w:proofErr w:type="spellStart"/>
-      <w:r>
-        <w:rPr>
-          <w:sz w:val="24"/>
-          <w:szCs w:val="24"/>
-        </w:rPr>
-        <w:t>DataPrep</w:t>
-      </w:r>
-      <w:proofErr w:type="spellEnd"/>
-      <w:r>
-        <w:rPr>
-          <w:sz w:val="24"/>
-          <w:szCs w:val="24"/>
-        </w:rPr>
-        <w:t xml:space="preserve"> subprocess. </w:t>
-      </w:r>
-    </w:p>
-    <w:p>
-      <w:pPr>
-        <w:pStyle w:val="ListParagraph"/>
+        <w:t xml:space="preserve">Screenshot of DataPrep subprocess. </w:t>
+      </w:r>
+    </w:p>
+    <w:p>
+      <w:pPr>
+        <w:pStyle w:val="a4"/>
         <w:rPr>
           <w:sz w:val="24"/>
           <w:szCs w:val="24"/>
@@ -965,16 +931,16 @@
     </w:p>
     <w:p>
       <w:pPr>
-        <w:pStyle w:val="ListParagraph"/>
-        <w:rPr>
-          <w:sz w:val="24"/>
-          <w:szCs w:val="24"/>
-        </w:rPr>
-      </w:pPr>
-    </w:p>
-    <w:p>
-      <w:pPr>
-        <w:pStyle w:val="ListParagraph"/>
+        <w:pStyle w:val="a4"/>
+        <w:rPr>
+          <w:sz w:val="24"/>
+          <w:szCs w:val="24"/>
+        </w:rPr>
+      </w:pPr>
+    </w:p>
+    <w:p>
+      <w:pPr>
+        <w:pStyle w:val="a4"/>
         <w:numPr>
           <w:ilvl w:val="0"/>
           <w:numId w:val="8"/>
@@ -995,7 +961,7 @@
     </w:p>
     <w:p>
       <w:pPr>
-        <w:pStyle w:val="ListParagraph"/>
+        <w:pStyle w:val="a4"/>
         <w:rPr>
           <w:sz w:val="24"/>
           <w:szCs w:val="24"/>
@@ -1045,16 +1011,16 @@
     </w:p>
     <w:p>
       <w:pPr>
-        <w:pStyle w:val="ListParagraph"/>
-        <w:rPr>
-          <w:sz w:val="24"/>
-          <w:szCs w:val="24"/>
-        </w:rPr>
-      </w:pPr>
-    </w:p>
-    <w:p>
-      <w:pPr>
-        <w:pStyle w:val="ListParagraph"/>
+        <w:pStyle w:val="a4"/>
+        <w:rPr>
+          <w:sz w:val="24"/>
+          <w:szCs w:val="24"/>
+        </w:rPr>
+      </w:pPr>
+    </w:p>
+    <w:p>
+      <w:pPr>
+        <w:pStyle w:val="a4"/>
         <w:numPr>
           <w:ilvl w:val="0"/>
           <w:numId w:val="8"/>
@@ -1075,7 +1041,7 @@
     </w:p>
     <w:p>
       <w:pPr>
-        <w:pStyle w:val="ListParagraph"/>
+        <w:pStyle w:val="a4"/>
         <w:spacing w:after="0"/>
         <w:rPr>
           <w:sz w:val="24"/>
@@ -1085,27 +1051,26 @@
     </w:p>
     <w:tbl>
       <w:tblPr>
-        <w:tblStyle w:val="TableGrid"/>
+        <w:tblStyle w:val="a3"/>
         <w:tblW w:w="0" w:type="auto"/>
         <w:tblInd w:w="720" w:type="dxa"/>
         <w:tblLook w:val="04A0" w:firstRow="1" w:lastRow="0" w:firstColumn="1" w:lastColumn="0" w:noHBand="0" w:noVBand="1"/>
       </w:tblPr>
       <w:tblGrid>
-        <w:gridCol w:w="2873"/>
-        <w:gridCol w:w="2900"/>
+        <w:gridCol w:w="3528"/>
+        <w:gridCol w:w="2245"/>
         <w:gridCol w:w="2857"/>
       </w:tblGrid>
       <w:tr>
         <w:tc>
           <w:tcPr>
-            <w:tcW w:w="2873" w:type="dxa"/>
+            <w:tcW w:w="3528" w:type="dxa"/>
           </w:tcPr>
           <w:p>
             <w:pPr>
-              <w:pStyle w:val="ListParagraph"/>
+              <w:pStyle w:val="a4"/>
               <w:ind w:left="0"/>
               <w:rPr>
-                <w:rFonts w:hint="eastAsia"/>
                 <w:sz w:val="24"/>
                 <w:szCs w:val="24"/>
                 <w:lang w:eastAsia="zh-CN"/>
@@ -1124,14 +1089,13 @@
         </w:tc>
         <w:tc>
           <w:tcPr>
-            <w:tcW w:w="2900" w:type="dxa"/>
+            <w:tcW w:w="2245" w:type="dxa"/>
           </w:tcPr>
           <w:p>
             <w:pPr>
-              <w:pStyle w:val="ListParagraph"/>
+              <w:pStyle w:val="a4"/>
               <w:ind w:left="0"/>
               <w:rPr>
-                <w:rFonts w:hint="eastAsia"/>
                 <w:sz w:val="24"/>
                 <w:szCs w:val="24"/>
                 <w:lang w:eastAsia="zh-CN"/>
@@ -1139,12 +1103,11 @@
             </w:pPr>
             <w:r>
               <w:rPr>
-                <w:rFonts w:hint="eastAsia"/>
-                <w:sz w:val="24"/>
-                <w:szCs w:val="24"/>
-                <w:lang w:eastAsia="zh-CN"/>
-              </w:rPr>
-              <w:t>Accuracy</w:t>
+                <w:sz w:val="24"/>
+                <w:szCs w:val="24"/>
+                <w:lang w:eastAsia="zh-CN"/>
+              </w:rPr>
+              <w:t>Before Resampling</w:t>
             </w:r>
           </w:p>
         </w:tc>
@@ -1154,10 +1117,9 @@
           </w:tcPr>
           <w:p>
             <w:pPr>
-              <w:pStyle w:val="ListParagraph"/>
+              <w:pStyle w:val="a4"/>
               <w:ind w:left="0"/>
               <w:rPr>
-                <w:rFonts w:hint="eastAsia"/>
                 <w:sz w:val="24"/>
                 <w:szCs w:val="24"/>
                 <w:lang w:eastAsia="zh-CN"/>
@@ -1165,12 +1127,11 @@
             </w:pPr>
             <w:r>
               <w:rPr>
-                <w:rFonts w:hint="eastAsia"/>
-                <w:sz w:val="24"/>
-                <w:szCs w:val="24"/>
-                <w:lang w:eastAsia="zh-CN"/>
-              </w:rPr>
-              <w:t>Rank</w:t>
+                <w:sz w:val="24"/>
+                <w:szCs w:val="24"/>
+                <w:lang w:eastAsia="zh-CN"/>
+              </w:rPr>
+              <w:t>After Resampling</w:t>
             </w:r>
           </w:p>
         </w:tc>
@@ -1178,11 +1139,11 @@
       <w:tr>
         <w:tc>
           <w:tcPr>
-            <w:tcW w:w="2873" w:type="dxa"/>
+            <w:tcW w:w="3528" w:type="dxa"/>
           </w:tcPr>
           <w:p>
             <w:pPr>
-              <w:pStyle w:val="ListParagraph"/>
+              <w:pStyle w:val="a4"/>
               <w:ind w:left="0"/>
               <w:rPr>
                 <w:sz w:val="24"/>
@@ -1196,17 +1157,239 @@
                 <w:szCs w:val="24"/>
                 <w:lang w:eastAsia="zh-CN"/>
               </w:rPr>
-              <w:t>Naive Bayes</w:t>
+              <w:t>Logistic Regression</w:t>
             </w:r>
           </w:p>
         </w:tc>
         <w:tc>
           <w:tcPr>
-            <w:tcW w:w="2900" w:type="dxa"/>
+            <w:tcW w:w="2245" w:type="dxa"/>
           </w:tcPr>
           <w:p>
             <w:pPr>
-              <w:pStyle w:val="ListParagraph"/>
+              <w:pStyle w:val="a4"/>
+              <w:ind w:left="0"/>
+              <w:rPr>
+                <w:sz w:val="24"/>
+                <w:szCs w:val="24"/>
+                <w:lang w:eastAsia="zh-CN"/>
+              </w:rPr>
+            </w:pPr>
+            <w:r>
+              <w:rPr>
+                <w:sz w:val="24"/>
+                <w:szCs w:val="24"/>
+                <w:lang w:eastAsia="zh-CN"/>
+              </w:rPr>
+              <w:t>73.48%</w:t>
+            </w:r>
+          </w:p>
+        </w:tc>
+        <w:tc>
+          <w:tcPr>
+            <w:tcW w:w="2857" w:type="dxa"/>
+          </w:tcPr>
+          <w:p>
+            <w:pPr>
+              <w:pStyle w:val="a4"/>
+              <w:ind w:left="0"/>
+              <w:rPr>
+                <w:sz w:val="24"/>
+                <w:szCs w:val="24"/>
+                <w:lang w:eastAsia="zh-CN"/>
+              </w:rPr>
+            </w:pPr>
+            <w:r>
+              <w:rPr>
+                <w:sz w:val="24"/>
+                <w:szCs w:val="24"/>
+                <w:lang w:eastAsia="zh-CN"/>
+              </w:rPr>
+              <w:t>73.85%</w:t>
+            </w:r>
+          </w:p>
+        </w:tc>
+      </w:tr>
+      <w:tr>
+        <w:tc>
+          <w:tcPr>
+            <w:tcW w:w="3528" w:type="dxa"/>
+          </w:tcPr>
+          <w:p>
+            <w:pPr>
+              <w:pStyle w:val="a4"/>
+              <w:ind w:left="0"/>
+              <w:rPr>
+                <w:sz w:val="24"/>
+                <w:szCs w:val="24"/>
+                <w:lang w:eastAsia="zh-CN"/>
+              </w:rPr>
+            </w:pPr>
+            <w:r>
+              <w:rPr>
+                <w:sz w:val="24"/>
+                <w:szCs w:val="24"/>
+                <w:lang w:eastAsia="zh-CN"/>
+              </w:rPr>
+              <w:t>kNN (k=5)</w:t>
+            </w:r>
+          </w:p>
+        </w:tc>
+        <w:tc>
+          <w:tcPr>
+            <w:tcW w:w="2245" w:type="dxa"/>
+          </w:tcPr>
+          <w:p>
+            <w:pPr>
+              <w:pStyle w:val="a4"/>
+              <w:ind w:left="0"/>
+              <w:rPr>
+                <w:sz w:val="24"/>
+                <w:szCs w:val="24"/>
+                <w:lang w:eastAsia="zh-CN"/>
+              </w:rPr>
+            </w:pPr>
+            <w:r>
+              <w:rPr>
+                <w:sz w:val="24"/>
+                <w:szCs w:val="24"/>
+                <w:lang w:eastAsia="zh-CN"/>
+              </w:rPr>
+              <w:t>73.48%</w:t>
+            </w:r>
+          </w:p>
+        </w:tc>
+        <w:tc>
+          <w:tcPr>
+            <w:tcW w:w="2857" w:type="dxa"/>
+          </w:tcPr>
+          <w:p>
+            <w:pPr>
+              <w:pStyle w:val="a4"/>
+              <w:ind w:left="0"/>
+              <w:rPr>
+                <w:sz w:val="24"/>
+                <w:szCs w:val="24"/>
+                <w:lang w:eastAsia="zh-CN"/>
+              </w:rPr>
+            </w:pPr>
+            <w:r>
+              <w:rPr>
+                <w:sz w:val="24"/>
+                <w:szCs w:val="24"/>
+                <w:lang w:eastAsia="zh-CN"/>
+              </w:rPr>
+              <w:t>73.33%</w:t>
+            </w:r>
+          </w:p>
+        </w:tc>
+      </w:tr>
+      <w:tr>
+        <w:tc>
+          <w:tcPr>
+            <w:tcW w:w="3528" w:type="dxa"/>
+          </w:tcPr>
+          <w:p>
+            <w:pPr>
+              <w:pStyle w:val="a4"/>
+              <w:ind w:left="0"/>
+              <w:rPr>
+                <w:sz w:val="24"/>
+                <w:szCs w:val="24"/>
+                <w:lang w:eastAsia="zh-CN"/>
+              </w:rPr>
+            </w:pPr>
+            <w:r>
+              <w:rPr>
+                <w:sz w:val="24"/>
+                <w:szCs w:val="24"/>
+                <w:lang w:eastAsia="zh-CN"/>
+              </w:rPr>
+              <w:t>SVM (RBF)</w:t>
+            </w:r>
+          </w:p>
+        </w:tc>
+        <w:tc>
+          <w:tcPr>
+            <w:tcW w:w="2245" w:type="dxa"/>
+          </w:tcPr>
+          <w:p>
+            <w:pPr>
+              <w:pStyle w:val="a4"/>
+              <w:ind w:left="0"/>
+              <w:rPr>
+                <w:sz w:val="24"/>
+                <w:szCs w:val="24"/>
+                <w:lang w:eastAsia="zh-CN"/>
+              </w:rPr>
+            </w:pPr>
+            <w:r>
+              <w:rPr>
+                <w:sz w:val="24"/>
+                <w:szCs w:val="24"/>
+                <w:lang w:eastAsia="zh-CN"/>
+              </w:rPr>
+              <w:t>77.39%</w:t>
+            </w:r>
+          </w:p>
+        </w:tc>
+        <w:tc>
+          <w:tcPr>
+            <w:tcW w:w="2857" w:type="dxa"/>
+          </w:tcPr>
+          <w:p>
+            <w:pPr>
+              <w:pStyle w:val="a4"/>
+              <w:ind w:left="0"/>
+              <w:rPr>
+                <w:sz w:val="24"/>
+                <w:szCs w:val="24"/>
+                <w:lang w:eastAsia="zh-CN"/>
+              </w:rPr>
+            </w:pPr>
+            <w:r>
+              <w:rPr>
+                <w:sz w:val="24"/>
+                <w:szCs w:val="24"/>
+                <w:lang w:eastAsia="zh-CN"/>
+              </w:rPr>
+              <w:t>72.82%</w:t>
+            </w:r>
+          </w:p>
+        </w:tc>
+      </w:tr>
+      <w:tr>
+        <w:tc>
+          <w:tcPr>
+            <w:tcW w:w="3528" w:type="dxa"/>
+          </w:tcPr>
+          <w:p>
+            <w:pPr>
+              <w:pStyle w:val="a4"/>
+              <w:ind w:left="0"/>
+              <w:rPr>
+                <w:sz w:val="24"/>
+                <w:szCs w:val="24"/>
+                <w:lang w:eastAsia="zh-CN"/>
+              </w:rPr>
+            </w:pPr>
+            <w:r>
+              <w:rPr>
+                <w:sz w:val="24"/>
+                <w:szCs w:val="24"/>
+                <w:lang w:eastAsia="zh-CN"/>
+              </w:rPr>
+              <w:t>Naïve Bayes</w:t>
+            </w:r>
+          </w:p>
+        </w:tc>
+        <w:tc>
+          <w:tcPr>
+            <w:tcW w:w="2245" w:type="dxa"/>
+          </w:tcPr>
+          <w:p>
+            <w:pPr>
+              <w:pStyle w:val="a4"/>
               <w:ind w:left="0"/>
               <w:rPr>
                 <w:sz w:val="24"/>
@@ -1230,10 +1413,9 @@
           </w:tcPr>
           <w:p>
             <w:pPr>
-              <w:pStyle w:val="ListParagraph"/>
+              <w:pStyle w:val="a4"/>
               <w:ind w:left="0"/>
               <w:rPr>
-                <w:rFonts w:hint="eastAsia"/>
                 <w:sz w:val="24"/>
                 <w:szCs w:val="24"/>
                 <w:lang w:eastAsia="zh-CN"/>
@@ -1241,12 +1423,11 @@
             </w:pPr>
             <w:r>
               <w:rPr>
-                <w:rFonts w:hint="eastAsia"/>
-                <w:sz w:val="24"/>
-                <w:szCs w:val="24"/>
-                <w:lang w:eastAsia="zh-CN"/>
-              </w:rPr>
-              <w:t>1</w:t>
+                <w:sz w:val="24"/>
+                <w:szCs w:val="24"/>
+                <w:lang w:eastAsia="zh-CN"/>
+              </w:rPr>
+              <w:t>72.82%</w:t>
             </w:r>
           </w:p>
         </w:tc>
@@ -1254,11 +1435,11 @@
       <w:tr>
         <w:tc>
           <w:tcPr>
-            <w:tcW w:w="2873" w:type="dxa"/>
+            <w:tcW w:w="3528" w:type="dxa"/>
           </w:tcPr>
           <w:p>
             <w:pPr>
-              <w:pStyle w:val="ListParagraph"/>
+              <w:pStyle w:val="a4"/>
               <w:ind w:left="0"/>
               <w:rPr>
                 <w:sz w:val="24"/>
@@ -1268,97 +1449,40 @@
             </w:pPr>
             <w:r>
               <w:rPr>
-                <w:sz w:val="24"/>
-                <w:szCs w:val="24"/>
-                <w:lang w:eastAsia="zh-CN"/>
-              </w:rPr>
-              <w:t>SVM</w:t>
+                <w:rFonts w:hint="eastAsia"/>
+                <w:sz w:val="24"/>
+                <w:szCs w:val="24"/>
+                <w:lang w:eastAsia="zh-CN"/>
+              </w:rPr>
+              <w:t xml:space="preserve">Stacking (kNN+NB+SVM </w:t>
+            </w:r>
+            <w:r>
+              <w:rPr>
+                <w:rFonts w:hint="eastAsia"/>
+                <w:sz w:val="24"/>
+                <w:szCs w:val="24"/>
+                <w:lang w:eastAsia="zh-CN"/>
+              </w:rPr>
+              <w:t>→</w:t>
+            </w:r>
+            <w:r>
+              <w:rPr>
+                <w:rFonts w:hint="eastAsia"/>
+                <w:sz w:val="24"/>
+                <w:szCs w:val="24"/>
+                <w:lang w:eastAsia="zh-CN"/>
+              </w:rPr>
+              <w:t xml:space="preserve"> LR)</w:t>
             </w:r>
           </w:p>
         </w:tc>
         <w:tc>
           <w:tcPr>
-            <w:tcW w:w="2900" w:type="dxa"/>
+            <w:tcW w:w="2245" w:type="dxa"/>
           </w:tcPr>
           <w:p>
             <w:pPr>
-              <w:pStyle w:val="ListParagraph"/>
-              <w:ind w:left="0"/>
-              <w:rPr>
-                <w:sz w:val="24"/>
-                <w:szCs w:val="24"/>
-                <w:lang w:eastAsia="zh-CN"/>
-              </w:rPr>
-            </w:pPr>
-            <w:r>
-              <w:rPr>
-                <w:sz w:val="24"/>
-                <w:szCs w:val="24"/>
-                <w:lang w:eastAsia="zh-CN"/>
-              </w:rPr>
-              <w:t>77.39%</w:t>
-            </w:r>
-          </w:p>
-        </w:tc>
-        <w:tc>
-          <w:tcPr>
-            <w:tcW w:w="2857" w:type="dxa"/>
-          </w:tcPr>
-          <w:p>
-            <w:pPr>
-              <w:pStyle w:val="ListParagraph"/>
-              <w:ind w:left="0"/>
-              <w:rPr>
-                <w:rFonts w:hint="eastAsia"/>
-                <w:sz w:val="24"/>
-                <w:szCs w:val="24"/>
-                <w:lang w:eastAsia="zh-CN"/>
-              </w:rPr>
-            </w:pPr>
-            <w:r>
-              <w:rPr>
-                <w:rFonts w:hint="eastAsia"/>
-                <w:sz w:val="24"/>
-                <w:szCs w:val="24"/>
-                <w:lang w:eastAsia="zh-CN"/>
-              </w:rPr>
-              <w:t>2</w:t>
-            </w:r>
-          </w:p>
-        </w:tc>
-      </w:tr>
-      <w:tr>
-        <w:tc>
-          <w:tcPr>
-            <w:tcW w:w="2873" w:type="dxa"/>
-          </w:tcPr>
-          <w:p>
-            <w:pPr>
-              <w:pStyle w:val="ListParagraph"/>
-              <w:ind w:left="0"/>
-              <w:rPr>
-                <w:sz w:val="24"/>
-                <w:szCs w:val="24"/>
-                <w:lang w:eastAsia="zh-CN"/>
-              </w:rPr>
-            </w:pPr>
-            <w:r>
-              <w:rPr>
-                <w:sz w:val="24"/>
-                <w:szCs w:val="24"/>
-                <w:lang w:eastAsia="zh-CN"/>
-              </w:rPr>
-              <w:t>Stacking</w:t>
-            </w:r>
-          </w:p>
-        </w:tc>
-        <w:tc>
-          <w:tcPr>
-            <w:tcW w:w="2900" w:type="dxa"/>
-          </w:tcPr>
-          <w:p>
-            <w:pPr>
-              <w:pStyle w:val="ListParagraph"/>
+              <w:pStyle w:val="a4"/>
               <w:ind w:left="0"/>
               <w:rPr>
                 <w:sz w:val="24"/>
@@ -1382,10 +1506,9 @@
           </w:tcPr>
           <w:p>
             <w:pPr>
-              <w:pStyle w:val="ListParagraph"/>
+              <w:pStyle w:val="a4"/>
               <w:ind w:left="0"/>
               <w:rPr>
-                <w:rFonts w:hint="eastAsia"/>
                 <w:sz w:val="24"/>
                 <w:szCs w:val="24"/>
                 <w:lang w:eastAsia="zh-CN"/>
@@ -1393,166 +1516,11 @@
             </w:pPr>
             <w:r>
               <w:rPr>
-                <w:rFonts w:hint="eastAsia"/>
-                <w:sz w:val="24"/>
-                <w:szCs w:val="24"/>
-                <w:lang w:eastAsia="zh-CN"/>
-              </w:rPr>
-              <w:t>3</w:t>
-            </w:r>
-          </w:p>
-        </w:tc>
-      </w:tr>
-      <w:tr>
-        <w:tc>
-          <w:tcPr>
-            <w:tcW w:w="2873" w:type="dxa"/>
-          </w:tcPr>
-          <w:p>
-            <w:pPr>
-              <w:pStyle w:val="ListParagraph"/>
-              <w:ind w:left="0"/>
-              <w:rPr>
-                <w:sz w:val="24"/>
-                <w:szCs w:val="24"/>
-                <w:lang w:eastAsia="zh-CN"/>
-              </w:rPr>
-            </w:pPr>
-            <w:proofErr w:type="spellStart"/>
-            <w:r>
-              <w:rPr>
-                <w:sz w:val="24"/>
-                <w:szCs w:val="24"/>
-                <w:lang w:eastAsia="zh-CN"/>
-              </w:rPr>
-              <w:t>kNN</w:t>
-            </w:r>
-            <w:proofErr w:type="spellEnd"/>
-          </w:p>
-        </w:tc>
-        <w:tc>
-          <w:tcPr>
-            <w:tcW w:w="2900" w:type="dxa"/>
-          </w:tcPr>
-          <w:p>
-            <w:pPr>
-              <w:pStyle w:val="ListParagraph"/>
-              <w:ind w:left="0"/>
-              <w:rPr>
-                <w:sz w:val="24"/>
-                <w:szCs w:val="24"/>
-                <w:lang w:eastAsia="zh-CN"/>
-              </w:rPr>
-            </w:pPr>
-            <w:r>
-              <w:rPr>
-                <w:sz w:val="24"/>
-                <w:szCs w:val="24"/>
-                <w:lang w:eastAsia="zh-CN"/>
-              </w:rPr>
-              <w:t>73.48%</w:t>
-            </w:r>
-          </w:p>
-        </w:tc>
-        <w:tc>
-          <w:tcPr>
-            <w:tcW w:w="2857" w:type="dxa"/>
-          </w:tcPr>
-          <w:p>
-            <w:pPr>
-              <w:pStyle w:val="ListParagraph"/>
-              <w:ind w:left="0"/>
-              <w:rPr>
-                <w:rFonts w:hint="eastAsia"/>
-                <w:sz w:val="24"/>
-                <w:szCs w:val="24"/>
-                <w:lang w:eastAsia="zh-CN"/>
-              </w:rPr>
-            </w:pPr>
-            <w:r>
-              <w:rPr>
-                <w:rFonts w:hint="eastAsia"/>
-                <w:sz w:val="24"/>
-                <w:szCs w:val="24"/>
-                <w:lang w:eastAsia="zh-CN"/>
-              </w:rPr>
-              <w:t>4</w:t>
-            </w:r>
-          </w:p>
-        </w:tc>
-      </w:tr>
-      <w:tr>
-        <w:tc>
-          <w:tcPr>
-            <w:tcW w:w="2873" w:type="dxa"/>
-          </w:tcPr>
-          <w:p>
-            <w:pPr>
-              <w:pStyle w:val="ListParagraph"/>
-              <w:ind w:left="0"/>
-              <w:rPr>
-                <w:sz w:val="24"/>
-                <w:szCs w:val="24"/>
-                <w:lang w:eastAsia="zh-CN"/>
-              </w:rPr>
-            </w:pPr>
-            <w:r>
-              <w:rPr>
-                <w:sz w:val="24"/>
-                <w:szCs w:val="24"/>
-                <w:lang w:eastAsia="zh-CN"/>
-              </w:rPr>
-              <w:t>LR</w:t>
-            </w:r>
-          </w:p>
-        </w:tc>
-        <w:tc>
-          <w:tcPr>
-            <w:tcW w:w="2900" w:type="dxa"/>
-          </w:tcPr>
-          <w:p>
-            <w:pPr>
-              <w:pStyle w:val="ListParagraph"/>
-              <w:ind w:left="0"/>
-              <w:rPr>
-                <w:sz w:val="24"/>
-                <w:szCs w:val="24"/>
-                <w:lang w:eastAsia="zh-CN"/>
-              </w:rPr>
-            </w:pPr>
-            <w:r>
-              <w:rPr>
-                <w:sz w:val="24"/>
-                <w:szCs w:val="24"/>
-                <w:lang w:eastAsia="zh-CN"/>
-              </w:rPr>
-              <w:t>73.48%</w:t>
-            </w:r>
-          </w:p>
-        </w:tc>
-        <w:tc>
-          <w:tcPr>
-            <w:tcW w:w="2857" w:type="dxa"/>
-          </w:tcPr>
-          <w:p>
-            <w:pPr>
-              <w:pStyle w:val="ListParagraph"/>
-              <w:ind w:left="0"/>
-              <w:rPr>
-                <w:rFonts w:hint="eastAsia"/>
-                <w:sz w:val="24"/>
-                <w:szCs w:val="24"/>
-                <w:lang w:eastAsia="zh-CN"/>
-              </w:rPr>
-            </w:pPr>
-            <w:r>
-              <w:rPr>
-                <w:rFonts w:hint="eastAsia"/>
-                <w:sz w:val="24"/>
-                <w:szCs w:val="24"/>
-                <w:lang w:eastAsia="zh-CN"/>
-              </w:rPr>
-              <w:t>5</w:t>
+                <w:sz w:val="24"/>
+                <w:szCs w:val="24"/>
+                <w:lang w:eastAsia="zh-CN"/>
+              </w:rPr>
+              <w:t>70.77%</w:t>
             </w:r>
           </w:p>
         </w:tc>
@@ -1560,7 +1528,7 @@
     </w:tbl>
     <w:p>
       <w:pPr>
-        <w:pStyle w:val="ListParagraph"/>
+        <w:pStyle w:val="a4"/>
         <w:rPr>
           <w:sz w:val="24"/>
           <w:szCs w:val="24"/>
@@ -1570,12 +1538,22 @@
     </w:p>
     <w:p>
       <w:pPr>
-        <w:spacing w:after="0"/>
-        <w:rPr>
-          <w:sz w:val="24"/>
-          <w:szCs w:val="24"/>
-        </w:rPr>
-      </w:pPr>
+        <w:pStyle w:val="a4"/>
+        <w:rPr>
+          <w:rFonts w:hint="eastAsia"/>
+          <w:sz w:val="24"/>
+          <w:szCs w:val="24"/>
+          <w:lang w:eastAsia="zh-CN"/>
+        </w:rPr>
+      </w:pPr>
+      <w:r>
+        <w:rPr>
+          <w:sz w:val="24"/>
+          <w:szCs w:val="24"/>
+          <w:lang w:eastAsia="zh-CN"/>
+        </w:rPr>
+        <w:t>Conclusion: The original dataset contains 768 instances (500 tested_negative / 268 tested_positive). After bootstrapping resampling, both classes were balanced to 384 each (768 total). Before resampling, Naïve Bayes achieved the highest accuracy (77.83%). After resampling, overall accuracy slightly decreased across all models, with Logistic Regression becoming the best model at 73.85%. The accuracy drop is expected because the models can no longer inflate their scores by simply predicting the majority class.</w:t>
+      </w:r>
     </w:p>
     <w:sectPr>
       <w:pgSz w:w="12240" w:h="15840"/>
@@ -2841,17 +2819,17 @@
     <w:lsdException w:name="Unresolved Mention" w:semiHidden="1" w:unhideWhenUsed="1"/>
     <w:lsdException w:name="Smart Link" w:semiHidden="1" w:unhideWhenUsed="1"/>
   </w:latentStyles>
-  <w:style w:type="paragraph" w:default="1" w:styleId="Normal">
+  <w:style w:type="paragraph" w:default="1" w:styleId="a">
     <w:name w:val="Normal"/>
     <w:qFormat/>
     <w:rsid w:val="00440281"/>
   </w:style>
-  <w:style w:type="character" w:default="1" w:styleId="DefaultParagraphFont">
+  <w:style w:type="character" w:default="1" w:styleId="a0">
     <w:name w:val="Default Paragraph Font"/>
     <w:uiPriority w:val="1"/>
     <w:unhideWhenUsed/>
   </w:style>
-  <w:style w:type="table" w:default="1" w:styleId="TableNormal">
+  <w:style w:type="table" w:default="1" w:styleId="a1">
     <w:name w:val="Normal Table"/>
     <w:uiPriority w:val="99"/>
     <w:semiHidden/>
@@ -2866,15 +2844,15 @@
       </w:tblCellMar>
     </w:tblPr>
   </w:style>
-  <w:style w:type="numbering" w:default="1" w:styleId="NoList">
+  <w:style w:type="numbering" w:default="1" w:styleId="a2">
     <w:name w:val="No List"/>
     <w:uiPriority w:val="99"/>
     <w:semiHidden/>
     <w:unhideWhenUsed/>
   </w:style>
-  <w:style w:type="table" w:styleId="TableGrid">
+  <w:style w:type="table" w:styleId="a3">
     <w:name w:val="Table Grid"/>
-    <w:basedOn w:val="TableNormal"/>
+    <w:basedOn w:val="a1"/>
     <w:uiPriority w:val="39"/>
     <w:rsid w:val="000A375B"/>
     <w:pPr>
@@ -2907,9 +2885,9 @@
       <w:szCs w:val="24"/>
     </w:rPr>
   </w:style>
-  <w:style w:type="paragraph" w:styleId="ListParagraph">
+  <w:style w:type="paragraph" w:styleId="a4">
     <w:name w:val="List Paragraph"/>
-    <w:basedOn w:val="Normal"/>
+    <w:basedOn w:val="a"/>
     <w:uiPriority w:val="34"/>
     <w:qFormat/>
     <w:rsid w:val="00340C92"/>

</xml_diff>